<commit_message>
Fix page-4 empty column: move Figure 1 after the headline result paragraph
The two-column layout left the lower-left column of page 4 empty: Figure 1 sat
immediately after the 5.1 heading with no body text before it, so the tall figure
landed alone in the right column and the columns could not balance. Moving Figure 1
to after the 5.1 result paragraph gives continuous text to fill both columns first;
the figure then renders as a clean full-width float, and text is continuous. Also a
better reading order (state the result, then the explanatory figure). Break-scan of
all 13 two-column pages is clean; 1-col 20 pp and 2-col 13 pp rebuilt.

Co-Authored-By: Claude Opus 4.8 <noreply@anthropic.com>
</commit_message>
<xml_diff>
--- a/docs/adrank-2col.docx
+++ b/docs/adrank-2col.docx
@@ -4068,6 +4068,67 @@
     </w:p>
     <w:p>
       <w:pPr>
+        <w:pStyle w:val="FirstParagraph"/>
+        <w:jc w:val="both"/>
+        <w:keepNext w:val="0"/>
+        <w:keepLines w:val="0"/>
+        <w:widowControl w:val="1"/>
+      </w:pPr>
+      <w:r>
+        <w:rPr>
+          <w:color w:val="000000"/>
+        </w:rPr>
+        <w:t xml:space="preserve">On the 26 tabular ADBench datasets, five-seed ADRank picks a detector within</w:t>
+      </w:r>
+      <w:r>
+        <w:rPr>
+          <w:color w:val="000000"/>
+        </w:rPr>
+        <w:t xml:space="preserve"> </w:t>
+      </w:r>
+      <w:r>
+        <w:rPr>
+          <w:b/>
+          <w:bCs/>
+          <w:color w:val="000000"/>
+        </w:rPr>
+        <w:t xml:space="preserve">regret@1 = 0.021 ± 0.003</w:t>
+      </w:r>
+      <w:r>
+        <w:rPr>
+          <w:color w:val="000000"/>
+        </w:rPr>
+        <w:t xml:space="preserve"> </w:t>
+      </w:r>
+      <w:r>
+        <w:rPr>
+          <w:color w:val="000000"/>
+        </w:rPr>
+        <w:t xml:space="preserve">of the best in the panel: the chosen detector is on average 2.1 AUC points from optimal, versus 9.3 points for random selection, a</w:t>
+      </w:r>
+      <w:r>
+        <w:rPr>
+          <w:color w:val="000000"/>
+        </w:rPr>
+        <w:t xml:space="preserve"> </w:t>
+      </w:r>
+      <w:r>
+        <w:rPr>
+          <w:b/>
+          <w:bCs/>
+          <w:color w:val="000000"/>
+        </w:rPr>
+        <w:t xml:space="preserve">77% reduction</w:t>
+      </w:r>
+      <w:r>
+        <w:rPr>
+          <w:color w:val="000000"/>
+        </w:rPr>
+        <w:t xml:space="preserve">. regret@3 falls to 0.007. The small standard deviation (±0.003) shows the selection is stable across seeds. On the secondary rank-correlation metric, ADRank reaches Spearman ρ = 0.63 ± 0.05 on the spread ≥ 0.10 subset with top-1 hit rate 31%. The consensus baseline scores ρ = -0.15, worse than random; the average detector's opinion is not a proxy for correctness. Scrambled ADRank scores ρ near zero, confirming the effect is not an artifact of the aggregation pipeline.</w:t>
+      </w:r>
+    </w:p>
+    <w:p>
+      <w:pPr>
         <w:pStyle w:val="BodyText"/>
         <w:jc w:val="center"/>
         <w:keepNext/>
@@ -4122,101 +4183,6 @@
     </w:p>
     <w:p>
       <w:pPr>
-        <w:pStyle w:val="ImageCaption"/>
-        <w:spacing w:before="80" w:after="120" w:line="240" w:lineRule="auto"/>
-        <w:jc w:val="center"/>
-        <w:keepNext w:val="0"/>
-        <w:keepLines/>
-        <w:widowControl w:val="1"/>
-      </w:pPr>
-      <w:r>
-        <w:rPr>
-          <w:b/>
-          <w:i/>
-          <w:color w:val="000000"/>
-        </w:rPr>
-        <w:t>Figure 1.</w:t>
-      </w:r>
-      <w:r>
-        <w:rPr>
-          <w:b w:val="0"/>
-          <w:i/>
-          <w:color w:val="000000"/>
-        </w:rPr>
-        <w:t xml:space="preserve"> </w:t>
-      </w:r>
-      <w:r>
-        <w:rPr>
-          <w:b w:val="0"/>
-          <w:i/>
-          <w:color w:val="000000"/>
-        </w:rPr>
-        <w:t>Why the secondary rank-correlation metric misleads, and the primary regret metric does not. Left: per-dataset Spearman ρ of ADRank against the true tabular ranking (red = negative). Right: the same datasets' regret@1 (lower is better; dashed line is the 0.093 random-pick regret). Every dataset with negative or weak ρ has near-zero regret (max 0.053, several exactly 0): its detectors are all bunched, either near-perfect (WDBC, WBC ≈ 0.99) or near-random (speech ≈ 0.50), so the true ranking is tie-noise that ρ punishes but on which any pick is a good pick. Spearman scores the full ordering including tied and irrelevant detectors; regret scores only the deployed pick. This is why we report regret as primary.</w:t>
-      </w:r>
-    </w:p>
-    <w:p>
-      <w:pPr>
-        <w:pStyle w:val="BodyText"/>
-        <w:jc w:val="both"/>
-        <w:keepNext w:val="0"/>
-        <w:keepLines w:val="0"/>
-        <w:widowControl w:val="1"/>
-      </w:pPr>
-      <w:r>
-        <w:rPr>
-          <w:color w:val="000000"/>
-        </w:rPr>
-        <w:t xml:space="preserve">On the 26 tabular ADBench datasets, five-seed ADRank picks a detector within</w:t>
-      </w:r>
-      <w:r>
-        <w:rPr>
-          <w:color w:val="000000"/>
-        </w:rPr>
-        <w:t xml:space="preserve"> </w:t>
-      </w:r>
-      <w:r>
-        <w:rPr>
-          <w:b/>
-          <w:bCs/>
-          <w:color w:val="000000"/>
-        </w:rPr>
-        <w:t xml:space="preserve">regret@1 = 0.021 ± 0.003</w:t>
-      </w:r>
-      <w:r>
-        <w:rPr>
-          <w:color w:val="000000"/>
-        </w:rPr>
-        <w:t xml:space="preserve"> </w:t>
-      </w:r>
-      <w:r>
-        <w:rPr>
-          <w:color w:val="000000"/>
-        </w:rPr>
-        <w:t xml:space="preserve">of the best in the panel: the chosen detector is on average 2.1 AUC points from optimal, versus 9.3 points for random selection, a</w:t>
-      </w:r>
-      <w:r>
-        <w:rPr>
-          <w:color w:val="000000"/>
-        </w:rPr>
-        <w:t xml:space="preserve"> </w:t>
-      </w:r>
-      <w:r>
-        <w:rPr>
-          <w:b/>
-          <w:bCs/>
-          <w:color w:val="000000"/>
-        </w:rPr>
-        <w:t xml:space="preserve">77% reduction</w:t>
-      </w:r>
-      <w:r>
-        <w:rPr>
-          <w:color w:val="000000"/>
-        </w:rPr>
-        <w:t xml:space="preserve">. regret@3 falls to 0.007. The small standard deviation (±0.003) shows the selection is stable across seeds. On the secondary rank-correlation metric, ADRank reaches Spearman ρ = 0.63 ± 0.05 on the spread ≥ 0.10 subset with top-1 hit rate 31%. The consensus baseline scores ρ = -0.15, worse than random; the average detector's opinion is not a proxy for correctness. Scrambled ADRank scores ρ near zero, confirming the effect is not an artifact of the aggregation pipeline.</w:t>
-      </w:r>
-    </w:p>
-    <w:p>
-      <w:pPr>
         <w:spacing w:before="0" w:after="0" w:line="440" w:lineRule="exact"/>
         <w:rPr>
           <w:sz w:val="2"/>
@@ -4239,6 +4205,40 @@
           <w:docGrid w:linePitch="360"/>
         </w:sectPr>
       </w:pPr>
+    </w:p>
+    <w:p>
+      <w:pPr>
+        <w:pStyle w:val="ImageCaption"/>
+        <w:spacing w:before="80" w:after="120" w:line="240" w:lineRule="auto"/>
+        <w:jc w:val="center"/>
+        <w:keepNext w:val="0"/>
+        <w:keepLines/>
+        <w:widowControl w:val="1"/>
+      </w:pPr>
+      <w:r>
+        <w:rPr>
+          <w:b/>
+          <w:i/>
+          <w:color w:val="000000"/>
+        </w:rPr>
+        <w:t>Figure 1.</w:t>
+      </w:r>
+      <w:r>
+        <w:rPr>
+          <w:b w:val="0"/>
+          <w:i/>
+          <w:color w:val="000000"/>
+        </w:rPr>
+        <w:t xml:space="preserve"> </w:t>
+      </w:r>
+      <w:r>
+        <w:rPr>
+          <w:b w:val="0"/>
+          <w:i/>
+          <w:color w:val="000000"/>
+        </w:rPr>
+        <w:t>Why the secondary rank-correlation metric misleads, and the primary regret metric does not. Left: per-dataset Spearman ρ of ADRank against the true tabular ranking (red = negative). Right: the same datasets' regret@1 (lower is better; dashed line is the 0.093 random-pick regret). Every dataset with negative or weak ρ has near-zero regret (max 0.053, several exactly 0): its detectors are all bunched, either near-perfect (WDBC, WBC ≈ 0.99) or near-random (speech ≈ 0.50), so the true ranking is tie-noise that ρ punishes but on which any pick is a good pick. Spearman scores the full ordering including tied and irrelevant detectors; regret scores only the deployed pick. This is why we report regret as primary.</w:t>
+      </w:r>
     </w:p>
     <w:tbl>
       <w:tblPr>

</xml_diff>

<commit_message>
Simplify the abstract for clarity and readability
Replace the single dense ~3500-char paragraph with three short, plain paragraphs
that lead with the proposal and value:
- what the problem is and how ADRank solves it, in plain terms ("treats clusters as
  stand-in anomalies; the detector that flags them best is the one to deploy")
- the distinctive property up front (needs no anomalies in its input)
- the headline results and value (78-93% below random, near-oracle; beats the IForest
  default, matches the best fixed detector; 187 unseen datasets, most robust skill),
  with the one honest limit
Secondary details (EM/MV, DAMI, deep detectors, stability) move to the body where they
already live. Rebuilt HTML, 1-col DOCX/PDF, 2-col Word DOCX/PDF, and LaTeX 2-col PDF.

Co-Authored-By: Claude Opus 4.8 <noreply@anthropic.com>
</commit_message>
<xml_diff>
--- a/docs/adrank-2col.docx
+++ b/docs/adrank-2col.docx
@@ -162,7 +162,23 @@
         <w:rPr>
           <w:color w:val="000000"/>
         </w:rPr>
-        <w:t xml:space="preserve">Selecting an anomaly detector for a new dataset is a chicken-and-egg problem: the natural criterion, held-out ROC-AUC, requires labeled anomalies that unsupervised deployments do not have. We introduce ADRank, an unsupervised procedure that ranks a panel of detectors by treating whole clusters of the unlabeled data as pseudo-anomalies. We cluster the data, hide a subset of clusters, fit each detector on the complement, and score the held-out clusters against a held-out normal fold. Detectors are ranked by their mean pseudo-AUC across many such cluster subsets. We measure a detector selector by</w:t>
+        <w:t xml:space="preserve">Choosing an anomaly detector for a new dataset is a chicken-and-egg problem: the natural way to compare detectors, held-out ROC-AUC, needs labeled anomalies, which unsupervised deployments do not have. We introduce ADRank, a method that ranks a panel of detectors with no labels. It treats clusters of the unlabeled data as stand-in anomalies: cluster the data, hide a few clusters, fit each detector on the rest, and score how well it flags the hidden clusters. The detector that flags them best is the one to deploy.</w:t>
+      </w:r>
+    </w:p>
+    <w:p>
+      <w:pPr>
+        <w:pStyle w:val="BodyText"/>
+        <w:ind w:left="432" w:right="432" w:firstLine="0"/>
+        <w:jc w:val="both"/>
+        <w:keepNext w:val="0"/>
+        <w:keepLines w:val="0"/>
+        <w:widowControl w:val="1"/>
+      </w:pPr>
+      <w:r>
+        <w:rPr>
+          <w:color w:val="000000"/>
+        </w:rPr>
+        <w:t xml:space="preserve">We score a selector by</w:t>
       </w:r>
       <w:r>
         <w:rPr>
@@ -182,7 +198,23 @@
         <w:rPr>
           <w:color w:val="000000"/>
         </w:rPr>
-        <w:t xml:space="preserve">: the true-AUC gap between the best detector in the panel and the one the selector picks, a threshold-free, decision-relevant quantity that stays well-behaved when detectors tie. The ranking signal comes from the geometry of normal data alone: in a contamination study regret is flat as real anomalies are added to the unlabeled input and unchanged at 0% contamination (pure normal data), so ADRank needs no anomalies in its input to rank the detectors that find them. An unsupervised auto-calibration removes the one weak spot a single fixed regime leaves on text: we run a bank of pseudo-anomaly regimes and weight each by how strongly it separates the detectors, a purely label-free signal. Across four modalities and 69 anomaly-detection tasks drawn from a smaller set of source corpora, with five seeds, auto-calibrated ADRank cuts detector-selection regret relative to random selection by 78% on tabular ADBench data, 93% on ResNet-18 image embeddings, 93% on BERT text embeddings, and 90% on windowed time-series. On these modalities it matches, within 0.01 AUC, an oracle that picks the best regime using labels. Measured against the harder baseline of a single fixed detector, ADRank beats the common Isolation Forest default significantly on image, text, and tabular data (paired p &lt; 0.05, and p &lt; 0.001 on the two embedding modalities) and matches the strongest fixed detector in the panel without knowing in advance which one that is. Frozen and run on 187 previously-unseen OddBench datasets, it has the lowest mean regret of any label-free strategy, below all nine fixed detectors, and ties that benchmark's best fixed detector; because the best fixed detector differs between benchmarks, no detector chosen in advance is safe across them. The result transfers to a separately preprocessed tabular benchmark (DAMI, 41% regret reduction) and survives adding deep detectors (AutoEncoder, DeepSVDD) to the panel. By a paired test ADRank beats the canonical Excess-Mass and Mass-Volume internal metrics significantly where their high-dimensional estimate breaks (image embeddings) and matches them on tabular and text; unlike them it never falls to the random-pick baseline, and the consensus heuristic is itself worse than random. ADRank is stable across seeds (regret standard deviation ≤ 0.002 after calibration), stable under drop-one detector-panel perturbations, and cheap to compute. We characterize its ceiling: because cluster-holdout pseudo-anomalies are local, the method under-serves datasets whose best detector is global; a per-feature marginal-tail regime, safe in distribution, closes the marginal part of this gap (on 164 held-out datasets, 0.102 to 0.090, p = 0.006), while datasets whose best detector is distributional remain open. We release the code, benchmark harness, and per-dataset results.</w:t>
+        <w:t xml:space="preserve">: the AUC gap between the best detector available and the one it picks. ADRank draws its signal from the shape of normal data alone. In a contamination study its regret does not change when every anomaly is removed from its input, so it needs no anomalies to find the detector that will.</w:t>
+      </w:r>
+    </w:p>
+    <w:p>
+      <w:pPr>
+        <w:pStyle w:val="BodyText"/>
+        <w:ind w:left="432" w:right="432" w:firstLine="0"/>
+        <w:jc w:val="both"/>
+        <w:keepNext w:val="0"/>
+        <w:keepLines w:val="0"/>
+        <w:widowControl w:val="1"/>
+      </w:pPr>
+      <w:r>
+        <w:rPr>
+          <w:color w:val="000000"/>
+        </w:rPr>
+        <w:t xml:space="preserve">Across 69 datasets spanning tabular, image, text, and time-series data, a label-free self-calibration cuts selection regret by 78 to 93% against a random pick, coming within 0.01 AUC of an oracle that uses labels. Against the harder bar of committing to one detector, ADRank beats the popular Isolation Forest default and matches the best fixed detector without knowing in advance which one it is. Frozen and run on 187 previously-unseen datasets, it has the lowest regret of any label-free strategy and the most robust skill across benchmarks; because the best fixed detector changes from one benchmark to the next, no advance choice is safe, and ADRank tracks the winner on its own. Its one limit is datasets whose best detector is global rather than local, which a marginal-tail variant partly closes. We release the code, benchmark, and per-dataset results.</w:t>
       </w:r>
     </w:p>
     <w:p>

</xml_diff>

<commit_message>
Rename method to NoMaS; title "Normal Manifold Separability"; separability framing
Title becomes "Anomaly Detector Model Selection by Normal Manifold
Separability"; short name NoMaS throughout. Add the motivation one-liner at
the method and name the score "held-out-cluster separability" (abstract,
score definition, aggregation). Rebuild all five deliverables.

Co-Authored-By: Claude Opus 4.8 <noreply@anthropic.com>
</commit_message>
<xml_diff>
--- a/docs/adrank-2col.docx
+++ b/docs/adrank-2col.docx
@@ -2,7 +2,7 @@
 <file path=word/document.xml><?xml version="1.0" encoding="utf-8"?>
 <w:document xmlns:w="http://schemas.openxmlformats.org/wordprocessingml/2006/main" xmlns:m="http://schemas.openxmlformats.org/officeDocument/2006/math" xmlns:r="http://schemas.openxmlformats.org/officeDocument/2006/relationships" xmlns:o="urn:schemas-microsoft-com:office:office" xmlns:v="urn:schemas-microsoft-com:vml" xmlns:w10="urn:schemas-microsoft-com:office:word" xmlns:a="http://schemas.openxmlformats.org/drawingml/2006/main" xmlns:pic="http://schemas.openxmlformats.org/drawingml/2006/picture" xmlns:wp="http://schemas.openxmlformats.org/drawingml/2006/wordprocessingDrawing">
   <w:body>
-    <w:bookmarkStart w:id="70" w:name="X43311a809a55f5f039c3aebc0d00798e43d9ae0"/>
+    <w:bookmarkStart w:id="70" w:name="X21bb77f71b307878073509d2b74b03e450e4e60"/>
     <w:p>
       <w:pPr>
         <w:pStyle w:val="Title"/>
@@ -16,7 +16,7 @@
         <w:rPr>
           <w:color w:val="000000"/>
         </w:rPr>
-        <w:t xml:space="preserve">Ranking Anomaly Detectors from Normal Data Alone</w:t>
+        <w:t xml:space="preserve">Anomaly Detector Model Selection by Normal Manifold Separability</w:t>
       </w:r>
     </w:p>
     <w:p>
@@ -162,7 +162,7 @@
         <w:rPr>
           <w:color w:val="000000"/>
         </w:rPr>
-        <w:t xml:space="preserve">Choosing an anomaly detector for a new dataset is a chicken-and-egg problem: comparing detectors by held-out ROC-AUC requires labeled anomalies, which unsupervised deployments lack. ADRank ranks a panel of detectors from the unlabeled data alone: cluster the data, hold out a few clusters as stand-in anomalies, fit each detector on the rest, and score how well it flags the held-out clusters. We evaluate a selector by</w:t>
+        <w:t xml:space="preserve">Choosing an anomaly detector for a new dataset is a chicken-and-egg problem: comparing detectors by held-out ROC-AUC requires labeled anomalies, which unsupervised deployments lack. NoMaS ranks a panel of detectors from the unlabeled data alone: cluster the data, hold out a few clusters as stand-in anomalies, fit each detector on the rest, and score how well it flags the held-out clusters, its held-out-cluster separability. Averaged over many held-out clusters, this separability is a label-free estimate of how well a detector has resolved the normal manifold, the competence it needs to separate true anomalies from normal. We evaluate a selector by</w:t>
       </w:r>
       <w:r>
         <w:rPr>
@@ -198,7 +198,7 @@
         <w:rPr>
           <w:color w:val="000000"/>
         </w:rPr>
-        <w:t xml:space="preserve">We develop ADRank on a benchmark of 69 datasets spanning tabular, image, text, and time-series modalities, where a label-free self-calibration cuts regret 78 to 93% below a random pick, within 0.01 AUC of a labels-based oracle. The signal comes from the geometry of normal data alone: regret is unchanged at 0% contamination, so ADRank needs no anomalies in its input to find the detector that will catch them. Against the harder bar of committing to one detector, it beats the Isolation Forest default and matches the best fixed detector without knowing in advance which one it is.</w:t>
+        <w:t xml:space="preserve">We develop NoMaS on a benchmark of 69 datasets spanning tabular, image, text, and time-series modalities, where a label-free self-calibration cuts regret 78 to 93% below a random pick, within 0.01 AUC of a labels-based oracle. The signal comes from the geometry of normal data alone: regret is unchanged at 0% contamination, so NoMaS needs no anomalies in its input to find the detector that will catch them. Against the harder bar of committing to one detector, it beats the Isolation Forest default and matches the best fixed detector without knowing in advance which one it is.</w:t>
       </w:r>
     </w:p>
     <w:p>
@@ -214,7 +214,7 @@
         <w:rPr>
           <w:color w:val="000000"/>
         </w:rPr>
-        <w:t xml:space="preserve">To test generalization, we freeze the method and run it, with no further tuning, on 187 previously-unseen tabular datasets from OddBench. There it attains the lowest regret of any label-free strategy and the most robust skill across benchmarks; because the best fixed detector changes from one benchmark to the next, no advance choice is safe, and ADRank tracks the winner on its own. One limit remains, datasets whose best detector is global rather than local, which a marginal-tail variant partly closes. We release the code, benchmark, and per-dataset results.</w:t>
+        <w:t xml:space="preserve">To test generalization, we freeze the method and run it, with no further tuning, on 187 previously-unseen tabular datasets from OddBench. There it attains the lowest regret of any label-free strategy and the most robust skill across benchmarks; because the best fixed detector changes from one benchmark to the next, no advance choice is safe, and NoMaS tracks the winner on its own. One limit remains, datasets whose best detector is global rather than local, which a marginal-tail variant partly closes. We release the code, benchmark, and per-dataset results.</w:t>
       </w:r>
     </w:p>
     <w:p>
@@ -312,7 +312,7 @@
         <w:rPr>
           <w:color w:val="000000"/>
         </w:rPr>
-        <w:t xml:space="preserve">The intuition is that real anomalies, by construction, look different from most normal points, and small distinct clusters share that property. If the analogy holds, we can rank detectors by their average pseudo-AUC across many cluster-holdout draws, without ever seeing a label.</w:t>
+        <w:t xml:space="preserve">The intuition runs through the detector's competence. Every anomaly detector is at heart a model of where the normal data lies, and it flags whatever falls outside that model, so a detector is only as good as its grasp of the normal geometry. A detector that has genuinely captured that geometry should recognize any coherent group of points that sits apart from the bulk, including a held-out cluster we designate as a stand-in anomaly. How well it separates that held-out cluster from the rest of the normal data is therefore a readout of how well it has modeled normal structure, the same competence it needs to separate true anomalies from normal. We can then rank detectors by their average pseudo-AUC across many cluster-holdout draws, without ever seeing a label. The reading is faithful to the degree that real anomalies resemble held-out clusters, compact and locally distinct, which is where the method works and, where they do not, where it meets its ceiling.</w:t>
       </w:r>
     </w:p>
     <w:p>
@@ -349,7 +349,7 @@
           <w:bCs/>
           <w:color w:val="000000"/>
         </w:rPr>
-        <w:t xml:space="preserve">ADRank</w:t>
+        <w:t xml:space="preserve">NoMaS</w:t>
       </w:r>
       <w:r>
         <w:rPr>
@@ -427,7 +427,7 @@
         <w:rPr>
           <w:color w:val="000000"/>
         </w:rPr>
-        <w:t xml:space="preserve">on 69 datasets across four modalities (tabular, image, text, time-series) with 9 canonical PyOD detectors and five seeds. ADRank cuts selection regret versus random by 73-90% on all four. The natural consensus baseline scores Spearman ρ = -0.15, worse than random.</w:t>
+        <w:t xml:space="preserve">on 69 datasets across four modalities (tabular, image, text, time-series) with 9 canonical PyOD detectors and five seeds. NoMaS cuts selection regret versus random by 73-90% on all four. The natural consensus baseline scores Spearman ρ = -0.15, worse than random.</w:t>
       </w:r>
     </w:p>
     <w:p>
@@ -507,7 +507,7 @@
         <w:rPr>
           <w:color w:val="000000"/>
         </w:rPr>
-        <w:t xml:space="preserve">The ranking signal comes from normal-data geometry alone: regret is flat as real anomalies are added to the unlabeled input and unchanged at 0% contamination (pure normals). And against the demanding baseline of a single fixed detector, ADRank has the lowest mean regret of any label-free strategy, beating the Isolation Forest default (paired p &lt; 0.05 on image, text, and tabular; p &lt; 0.001 on the two embedding modalities) and matching the best fixed detector without knowing which one it is, both in-distribution and on 187 previously-unseen OddBench datasets.</w:t>
+        <w:t xml:space="preserve">The ranking signal comes from normal-data geometry alone: regret is flat as real anomalies are added to the unlabeled input and unchanged at 0% contamination (pure normals). And against the demanding baseline of a single fixed detector, NoMaS has the lowest mean regret of any label-free strategy, beating the Isolation Forest default (paired p &lt; 0.05 on image, text, and tabular; p &lt; 0.001 on the two embedding modalities) and matching the best fixed detector without knowing which one it is, both in-distribution and on 187 previously-unseen OddBench datasets.</w:t>
       </w:r>
     </w:p>
     <w:p>
@@ -615,7 +615,7 @@
         <w:rPr>
           <w:color w:val="000000"/>
         </w:rPr>
-        <w:t xml:space="preserve">The central difficulty is choosing among detectors or configurations without labels. Internal metrics score a single detector from properties of its own output: excess-mass and mass-volume curves [1], and the internal relative-evaluation score IREOS [2]. These are detector-anchored and do not define a common task on which two detectors are directly comparable. Meta-learning approaches such as MetaOD [3] regress from dataset meta-features to expected performance, but require a labeled meta-training corpus and generalize only within its coverage. A recent review [17] evaluates a broad set of internal strategies and finds that none is reliably better than naive baselines across benchmarks, motivating fundamentally different signals. ADRank instead constructs a common pseudo-labeled task per dataset and lets ROC-AUC rank the detectors, needing neither labels nor meta-training.</w:t>
+        <w:t xml:space="preserve">The central difficulty is choosing among detectors or configurations without labels. Internal metrics score a single detector from properties of its own output: excess-mass and mass-volume curves [1], and the internal relative-evaluation score IREOS [2]. These are detector-anchored and do not define a common task on which two detectors are directly comparable. Meta-learning approaches such as MetaOD [3] regress from dataset meta-features to expected performance, but require a labeled meta-training corpus and generalize only within its coverage. A recent review [17] evaluates a broad set of internal strategies and finds that none is reliably better than naive baselines across benchmarks, motivating fundamentally different signals. NoMaS instead constructs a common pseudo-labeled task per dataset and lets ROC-AUC rank the detectors, needing neither labels nor meta-training.</w:t>
       </w:r>
     </w:p>
     <w:p>
@@ -644,7 +644,7 @@
         <w:rPr>
           <w:color w:val="000000"/>
         </w:rPr>
-        <w:t xml:space="preserve">Averaging or combining detector scores yields a consensus outlier score used both as an ensemble output and, implicitly, as a selection signal that favors detectors agreeing with the majority [4, 18]. Our experiments show consensus fails as a ranking signal on ADBench (ρ = -0.15): the detectors most correlated with the panel mean are not those most correct on real anomalies. ADRank does not assume agreement implies correctness; it measures each detector against an externally constructed pseudo-labeled task.</w:t>
+        <w:t xml:space="preserve">Averaging or combining detector scores yields a consensus outlier score used both as an ensemble output and, implicitly, as a selection signal that favors detectors agreeing with the majority [4, 18]. Our experiments show consensus fails as a ranking signal on ADBench (ρ = -0.15): the detectors most correlated with the panel mean are not those most correct on real anomalies. NoMaS does not assume agreement implies correctness; it measures each detector against an externally constructed pseudo-labeled task.</w:t>
       </w:r>
     </w:p>
     <w:p>
@@ -699,7 +699,7 @@
         <w:rPr>
           <w:color w:val="000000"/>
         </w:rPr>
-        <w:t xml:space="preserve">a single detector. ADRank uses pseudo-labels for the different purpose of</w:t>
+        <w:t xml:space="preserve">a single detector. NoMaS uses pseudo-labels for the different purpose of</w:t>
       </w:r>
       <w:r>
         <w:rPr>
@@ -747,6 +747,21 @@
     <w:p>
       <w:pPr>
         <w:pStyle w:val="FirstParagraph"/>
+        <w:jc w:val="both"/>
+        <w:keepNext w:val="0"/>
+        <w:keepLines w:val="0"/>
+        <w:widowControl w:val="1"/>
+      </w:pPr>
+      <w:r>
+        <w:rPr>
+          <w:color w:val="000000"/>
+        </w:rPr>
+        <w:t xml:space="preserve">A detector that understands normal data well enough to tell its own sub-structure apart should, for the same reason, tell normal from anomalous; we measure the first to predict the second.</w:t>
+      </w:r>
+    </w:p>
+    <w:p>
+      <w:pPr>
+        <w:pStyle w:val="BodyText"/>
         <w:jc w:val="both"/>
         <w:keepNext w:val="0"/>
         <w:keepLines w:val="0"/>
@@ -1602,7 +1617,7 @@
           <w:bCs/>
           <w:color w:val="000000"/>
         </w:rPr>
-        <w:t xml:space="preserve">Pseudo-AUC.</w:t>
+        <w:t xml:space="preserve">Held-out-cluster separability.</w:t>
       </w:r>
       <w:r>
         <w:rPr>
@@ -1761,7 +1776,7 @@
         <w:rPr>
           <w:color w:val="000000"/>
         </w:rPr>
-        <w:t xml:space="preserve">, and compute pseudo-AUC</w:t>
+        <w:t xml:space="preserve">, and compute the pseudo-AUC</w:t>
       </w:r>
       <w:r>
         <w:rPr>
@@ -1944,7 +1959,65 @@
         <w:rPr>
           <w:color w:val="000000"/>
         </w:rPr>
-        <w:t xml:space="preserve">labeled 0. If</w:t>
+        <w:t xml:space="preserve">labeled 0. This pseudo-AUC is the detector's held-out-cluster separability: how well its scores pull the excised cluster</w:t>
+      </w:r>
+      <w:r>
+        <w:rPr>
+          <w:color w:val="000000"/>
+        </w:rPr>
+        <w:t xml:space="preserve"> </w:t>
+      </w:r>
+      <m:oMath>
+        <m:sSub>
+          <m:e>
+            <m:r>
+              <m:t>S</m:t>
+            </m:r>
+          </m:e>
+          <m:sub>
+            <m:r>
+              <m:t>j</m:t>
+            </m:r>
+          </m:sub>
+        </m:sSub>
+      </m:oMath>
+      <w:r>
+        <w:rPr>
+          <w:color w:val="000000"/>
+        </w:rPr>
+        <w:t xml:space="preserve"> </w:t>
+      </w:r>
+      <w:r>
+        <w:rPr>
+          <w:color w:val="000000"/>
+        </w:rPr>
+        <w:t xml:space="preserve">apart from the retained normals</w:t>
+      </w:r>
+      <w:r>
+        <w:rPr>
+          <w:color w:val="000000"/>
+        </w:rPr>
+        <w:t xml:space="preserve"> </w:t>
+      </w:r>
+      <m:oMath>
+        <m:sSub>
+          <m:e>
+            <m:r>
+              <m:t>N</m:t>
+            </m:r>
+          </m:e>
+          <m:sub>
+            <m:r>
+              <m:t>j</m:t>
+            </m:r>
+          </m:sub>
+        </m:sSub>
+      </m:oMath>
+      <w:r>
+        <w:rPr>
+          <w:color w:val="000000"/>
+        </w:rPr>
+        <w:t xml:space="preserve">. If</w:t>
       </w:r>
       <w:r>
         <w:rPr>
@@ -2161,7 +2234,24 @@
         <w:rPr>
           <w:color w:val="000000"/>
         </w:rPr>
-        <w:t xml:space="preserve">, and detectors are ranked by</w:t>
+        <w:t xml:space="preserve">, our estimate of detector</w:t>
+      </w:r>
+      <w:r>
+        <w:rPr>
+          <w:color w:val="000000"/>
+        </w:rPr>
+        <w:t xml:space="preserve"> </w:t>
+      </w:r>
+      <m:oMath>
+        <m:r>
+          <m:t>D</m:t>
+        </m:r>
+      </m:oMath>
+      <w:r>
+        <w:rPr>
+          <w:color w:val="000000"/>
+        </w:rPr>
+        <w:t xml:space="preserve">'s normal-manifold separability, and detectors are ranked by</w:t>
       </w:r>
       <w:r>
         <w:rPr>
@@ -2624,7 +2714,7 @@
         <w:rPr>
           <w:color w:val="000000"/>
         </w:rPr>
-        <w:t xml:space="preserve">; ADRank never sees them.</w:t>
+        <w:t xml:space="preserve">; NoMaS never sees them.</w:t>
       </w:r>
     </w:p>
     <w:p>
@@ -2775,7 +2865,7 @@
         <w:rPr>
           <w:color w:val="000000"/>
         </w:rPr>
-        <w:t xml:space="preserve">be the detector ADRank ranks first and</w:t>
+        <w:t xml:space="preserve">be the detector NoMaS ranks first and</w:t>
       </w:r>
       <w:r>
         <w:rPr>
@@ -3062,7 +3152,7 @@
         <w:rPr>
           <w:color w:val="000000"/>
         </w:rPr>
-        <w:t xml:space="preserve">and regret@3 uses the best of ADRank's top three picks. Regret is</w:t>
+        <w:t xml:space="preserve">and regret@3 uses the best of NoMaS's top three picks. Regret is</w:t>
       </w:r>
       <w:r>
         <w:rPr>
@@ -4008,7 +4098,7 @@
           <w:iCs/>
           <w:color w:val="000000"/>
         </w:rPr>
-        <w:t xml:space="preserve">Scrambled ADRank:</w:t>
+        <w:t xml:space="preserve">Scrambled NoMaS:</w:t>
       </w:r>
       <w:r>
         <w:rPr>
@@ -4020,7 +4110,7 @@
         <w:rPr>
           <w:color w:val="000000"/>
         </w:rPr>
-        <w:t xml:space="preserve">apply ADRank but randomly permute the pseudo-AUC values before aggregation. Expected ρ = 0. Preregistered sanity check.</w:t>
+        <w:t xml:space="preserve">apply NoMaS but randomly permute the pseudo-AUC values before aggregation. Expected ρ = 0. Preregistered sanity check.</w:t>
       </w:r>
     </w:p>
     <w:p>
@@ -4110,7 +4200,7 @@
         <w:rPr>
           <w:color w:val="000000"/>
         </w:rPr>
-        <w:t xml:space="preserve">On the 26 tabular ADBench datasets, five-seed ADRank picks a detector within</w:t>
+        <w:t xml:space="preserve">On the 26 tabular ADBench datasets, five-seed NoMaS picks a detector within</w:t>
       </w:r>
       <w:r>
         <w:rPr>
@@ -4156,7 +4246,7 @@
         <w:rPr>
           <w:color w:val="000000"/>
         </w:rPr>
-        <w:t xml:space="preserve">. regret@3 falls to 0.007. The small standard deviation (±0.003) shows the selection is stable across seeds. On the secondary rank-correlation metric, ADRank reaches Spearman ρ = 0.63 ± 0.05 on the spread ≥ 0.10 subset with top-1 hit rate 31%. The consensus baseline scores ρ = -0.15, worse than random; the average detector's opinion is not a proxy for correctness. Scrambled ADRank scores ρ near zero, confirming the effect is not an artifact of the aggregation pipeline.</w:t>
+        <w:t xml:space="preserve">. regret@3 falls to 0.007. The small standard deviation (±0.003) shows the selection is stable across seeds. On the secondary rank-correlation metric, NoMaS reaches Spearman ρ = 0.63 ± 0.05 on the spread ≥ 0.10 subset with top-1 hit rate 31%. The consensus baseline scores ρ = -0.15, worse than random; the average detector's opinion is not a proxy for correctness. Scrambled NoMaS scores ρ near zero, confirming the effect is not an artifact of the aggregation pipeline.</w:t>
       </w:r>
     </w:p>
     <w:p>
@@ -4175,7 +4265,7 @@
           <wp:inline>
             <wp:extent cx="2984601" cy="2316133"/>
             <wp:effectExtent b="0" l="0" r="0" t="0"/>
-            <wp:docPr descr="Per-dataset Spearman rho for best ADRank config, colored by true-AUC spread across detectors" title="" id="16" name="Picture"/>
+            <wp:docPr descr="Per-dataset Spearman rho for best NoMaS config, colored by true-AUC spread across detectors" title="" id="16" name="Picture"/>
             <a:graphic>
               <a:graphicData uri="http://schemas.openxmlformats.org/drawingml/2006/picture">
                 <pic:pic>
@@ -4269,7 +4359,7 @@
           <w:i/>
           <w:color w:val="000000"/>
         </w:rPr>
-        <w:t>Why the secondary rank-correlation metric misleads, and the primary regret metric does not. Left: per-dataset Spearman ρ of ADRank against the true tabular ranking (red = negative). Right: the same datasets' regret@1 (lower is better; dashed line is the 0.093 random-pick regret). Every dataset with negative or weak ρ has near-zero regret (max 0.053, several exactly 0): its detectors are all bunched, either near-perfect (WDBC, WBC ≈ 0.99) or near-random (speech ≈ 0.50), so the true ranking is tie-noise that ρ punishes but on which any pick is a good pick. Spearman scores the full ordering including tied and irrelevant detectors; regret scores only the deployed pick. This is why we report regret as primary.</w:t>
+        <w:t>Why the secondary rank-correlation metric misleads, and the primary regret metric does not. Left: per-dataset Spearman ρ of NoMaS against the true tabular ranking (red = negative). Right: the same datasets' regret@1 (lower is better; dashed line is the 0.093 random-pick regret). Every dataset with negative or weak ρ has near-zero regret (max 0.053, several exactly 0): its detectors are all bunched, either near-perfect (WDBC, WBC ≈ 0.99) or near-random (speech ≈ 0.50), so the true ranking is tie-noise that ρ punishes but on which any pick is a good pick. Spearman scores the full ordering including tied and irrelevant detectors; regret scores only the deployed pick. This is why we report regret as primary.</w:t>
       </w:r>
     </w:p>
     <w:tbl>
@@ -4489,7 +4579,7 @@
                 <w:color w:val="000000"/>
                 <w:sz w:val="19"/>
               </w:rPr>
-              <w:t xml:space="preserve">ADRank</w:t>
+              <w:t xml:space="preserve">NoMaS</w:t>
             </w:r>
             <w:r>
               <w:rPr>
@@ -4965,7 +5055,7 @@
                 <w:color w:val="000000"/>
                 <w:sz w:val="19"/>
               </w:rPr>
-              <w:t xml:space="preserve">Scrambled ADRank (control)</w:t>
+              <w:t xml:space="preserve">Scrambled NoMaS (control)</w:t>
             </w:r>
           </w:p>
         </w:tc>
@@ -5147,7 +5237,7 @@
           <w:i/>
           <w:color w:val="000000"/>
         </w:rPr>
-        <w:t>Tabular headline, mean over 26 datasets and five seeds. ADRank cuts selection regret by 77% versus random and clears the consensus baseline, which is worse than random on rank correlation. Regret standard deviation across seeds is small, so the ranking is stable.</w:t>
+        <w:t>Tabular headline, mean over 26 datasets and five seeds. NoMaS cuts selection regret by 77% versus random and clears the consensus baseline, which is worse than random on rank correlation. Regret standard deviation across seeds is small, so the ranking is stable.</w:t>
       </w:r>
     </w:p>
     <w:p>
@@ -5235,7 +5325,7 @@
           <w:i/>
           <w:color w:val="000000"/>
         </w:rPr>
-        <w:t>Spearman ρ of ADRank vs true-AUC spread across the detector panel, per dataset, all aggregation variants. Right of the vertical dashed line at spread = 0.10 the ranking question is well-posed; there ADRank is systematically positive. Left of it, the "true" ranking is dominated by near-ties, and correlation is dominated by noise.</w:t>
+        <w:t>Spearman ρ of NoMaS vs true-AUC spread across the detector panel, per dataset, all aggregation variants. Right of the vertical dashed line at spread = 0.10 the ranking question is well-posed; there NoMaS is systematically positive. Left of it, the "true" ranking is dominated by near-ties, and correlation is dominated by noise.</w:t>
       </w:r>
     </w:p>
     <w:bookmarkEnd w:id="21"/>
@@ -6812,7 +6902,7 @@
         <w:rPr>
           <w:color w:val="000000"/>
         </w:rPr>
-        <w:t xml:space="preserve">ADRank cuts detector-selection regret versus random by</w:t>
+        <w:t xml:space="preserve">NoMaS cuts detector-selection regret versus random by</w:t>
       </w:r>
       <w:r>
         <w:rPr>
@@ -7009,7 +7099,7 @@
         <w:rPr>
           <w:color w:val="000000"/>
         </w:rPr>
-        <w:t xml:space="preserve">The takeaway: given any encoder that produces a fixed-length vector per input, ADRank selects a near-best detector on all four modalities under the ensemble default, and the auto-calibration of Section 5.3 sharpens the two embedding modalities further.</w:t>
+        <w:t xml:space="preserve">The takeaway: given any encoder that produces a fixed-length vector per input, NoMaS selects a near-best detector on all four modalities under the ensemble default, and the auto-calibration of Section 5.3 sharpens the two embedding modalities further.</w:t>
       </w:r>
     </w:p>
     <w:bookmarkEnd w:id="22"/>
@@ -7040,7 +7130,7 @@
         <w:rPr>
           <w:color w:val="000000"/>
         </w:rPr>
-        <w:t xml:space="preserve">A single pseudo-anomaly regime can under-serve embedding data: the true-best text detector is a local-density method (LOF wins on most of the 13 datasets), but under a smallest-cluster regime alone the held-out compact clusters are separated as well by KNN, so ADRank's pick flips to KNN or CBLOF and forfeits LOF's advantage (text regret 0.065 under smallest-only, versus 0.022 under the ensemble default of Table 2). Rather than hand-pick a regime per modality, we let the data choose: run the regime bank of Section 3 and weight each regime by its cross-detector pseudo-AUC variance, a label-free measure of how well the regime discriminates detectors (Table 3).</w:t>
+        <w:t xml:space="preserve">A single pseudo-anomaly regime can under-serve embedding data: the true-best text detector is a local-density method (LOF wins on most of the 13 datasets), but under a smallest-cluster regime alone the held-out compact clusters are separated as well by KNN, so NoMaS's pick flips to KNN or CBLOF and forfeits LOF's advantage (text regret 0.065 under smallest-only, versus 0.022 under the ensemble default of Table 2). Rather than hand-pick a regime per modality, we let the data choose: run the regime bank of Section 3 and weight each regime by its cross-detector pseudo-AUC variance, a label-free measure of how well the regime discriminates detectors (Table 3).</w:t>
       </w:r>
     </w:p>
     <w:p>
@@ -8102,7 +8192,7 @@
           <wp:inline>
             <wp:extent cx="2984601" cy="1671376"/>
             <wp:effectExtent b="0" l="0" r="0" t="0"/>
-            <wp:docPr descr="Bar chart of regret@1 for random pick, fixed-ensemble ADRank, and auto-calibrated ADRank across four modalities" title="" id="24" name="Picture"/>
+            <wp:docPr descr="Bar chart of regret@1 for random pick, fixed-ensemble NoMaS, and auto-calibrated NoMaS across four modalities" title="" id="24" name="Picture"/>
             <a:graphic>
               <a:graphicData uri="http://schemas.openxmlformats.org/drawingml/2006/picture">
                 <pic:pic>
@@ -8206,7 +8296,7 @@
         <w:rPr>
           <w:color w:val="000000"/>
         </w:rPr>
-        <w:t xml:space="preserve">, the locally-embedded one that exercises local-density detection, and under calibration ADRank picks LOF on all 13 (versus KNN/CBLOF before). The weighting adapts rather than fixing on one regime: on two text datasets it up-weights</w:t>
+        <w:t xml:space="preserve">, the locally-embedded one that exercises local-density detection, and under calibration NoMaS picks LOF on all 13 (versus KNN/CBLOF before). The weighting adapts rather than fixing on one regime: on two text datasets it up-weights</w:t>
       </w:r>
       <w:r>
         <w:rPr>
@@ -8261,7 +8351,7 @@
         <w:rPr>
           <w:color w:val="000000"/>
         </w:rPr>
-        <w:t xml:space="preserve">Table 4 sets ADRank against the canonical Excess-Mass and Mass-Volume internal metrics [1], on the same datasets and true rankings. ADRank has lower mean regret than both EM and MV on every modality, but a paired analysis (per-dataset regret over seeds, Wilcoxon signed-rank) sharpens the picture. ADRank beats random with high significance everywhere (tabular p = 1e-5, image p = 4e-6, text p = 5e-4; 23/26, 19/20, 12/13 datasets won). Against EM it is significantly better only where EM's high-dimensional volume estimate breaks: on 512-dimensional image embeddings ADRank wins 20 of 20 datasets (p = 2e-6), whereas on tabular (p = 0.80, 11/26 wins) and text (p = 0.69) the two are statistically comparable. The robust claim is therefore not that ADRank uniformly dominates EM/MV, but that it matches them where they work and stays well above random where they collapse below it: EM and MV fall to or under random on image embeddings and DAMI (EM 0.078 vs random 0.074 on images; 0.074 vs 0.067 on DAMI), while ADRank never does. The pooled skill</w:t>
+        <w:t xml:space="preserve">Table 4 sets NoMaS against the canonical Excess-Mass and Mass-Volume internal metrics [1], on the same datasets and true rankings. NoMaS has lower mean regret than both EM and MV on every modality, but a paired analysis (per-dataset regret over seeds, Wilcoxon signed-rank) sharpens the picture. NoMaS beats random with high significance everywhere (tabular p = 1e-5, image p = 4e-6, text p = 5e-4; 23/26, 19/20, 12/13 datasets won). Against EM it is significantly better only where EM's high-dimensional volume estimate breaks: on 512-dimensional image embeddings NoMaS wins 20 of 20 datasets (p = 2e-6), whereas on tabular (p = 0.80, 11/26 wins) and text (p = 0.69) the two are statistically comparable. The robust claim is therefore not that NoMaS uniformly dominates EM/MV, but that it matches them where they work and stays well above random where they collapse below it: EM and MV fall to or under random on image embeddings and DAMI (EM 0.078 vs random 0.074 on images; 0.074 vs 0.067 on DAMI), while NoMaS never does. The pooled skill</w:t>
       </w:r>
       <w:r>
         <w:rPr>
@@ -8284,7 +8374,7 @@
         <w:rPr>
           <w:color w:val="000000"/>
         </w:rPr>
-        <w:t xml:space="preserve">(Section 4) ranges from 0.93 on images to 0.43 on the hard DAMI benchmark, the fraction of the achievable over-random improvement ADRank captures on each.</w:t>
+        <w:t xml:space="preserve">(Section 4) ranges from 0.93 on images to 0.43 on the hard DAMI benchmark, the fraction of the achievable over-random improvement NoMaS captures on each.</w:t>
       </w:r>
     </w:p>
     <w:p>
@@ -8530,7 +8620,7 @@
                 <w:color w:val="000000"/>
                 <w:sz w:val="18"/>
               </w:rPr>
-              <w:t xml:space="preserve">ADRank</w:t>
+              <w:t xml:space="preserve">NoMaS</w:t>
             </w:r>
           </w:p>
         </w:tc>
@@ -8562,7 +8652,7 @@
                 <w:color w:val="000000"/>
                 <w:sz w:val="18"/>
               </w:rPr>
-              <w:t xml:space="preserve">ADRank skill</w:t>
+              <w:t xml:space="preserve">NoMaS skill</w:t>
             </w:r>
             <w:r>
               <w:rPr>
@@ -9837,7 +9927,7 @@
           <w:i/>
           <w:color w:val="000000"/>
         </w:rPr>
-        <w:t>regret@1 (absolute AUC points; lower is better) for ADRank versus label-free baselines. EM/MV are the Goix internal metrics, estimated by scoring both the data and a uniform Monte-Carlo sample of the feature box with each fitted detector. Consensus (rank by agreement with the mean detector score) scores Spearman ρ = -0.15 on tabular and is worse than random; its regret is dominated by that failure and omitted here for brevity. "skill" is the pooled selection skill  over the modality's datasets (Section 4), the fraction of the achievable over-random improvement ADRank captures; pooling weights each dataset by how much the choice mattered, so it differs slightly from one minus the ratio of the rounded column means. ADRank is lowest on every row, and unlike EM/MV never falls to the random baseline.</w:t>
+        <w:t>regret@1 (absolute AUC points; lower is better) for NoMaS versus label-free baselines. EM/MV are the Goix internal metrics, estimated by scoring both the data and a uniform Monte-Carlo sample of the feature box with each fitted detector. Consensus (rank by agreement with the mean detector score) scores Spearman ρ = -0.15 on tabular and is worse than random; its regret is dominated by that failure and omitted here for brevity. "skill" is the pooled selection skill  over the modality's datasets (Section 4), the fraction of the achievable over-random improvement NoMaS captures; pooling weights each dataset by how much the choice mattered, so it differs slightly from one minus the ratio of the rounded column means. NoMaS is lowest on every row, and unlike EM/MV never falls to the random baseline.</w:t>
       </w:r>
     </w:p>
     <w:bookmarkEnd w:id="26"/>
@@ -9882,7 +9972,7 @@
         <w:rPr>
           <w:color w:val="000000"/>
         </w:rPr>
-        <w:t xml:space="preserve">On the independently-preprocessed DAMI datasets, auto-calibrated ADRank cuts regret by 41% versus random (regret@1 = 0.040 ± 0.004 vs 0.067), with the fixed ensemble at 36%. This is a clear, significant transfer, but well below the 78% on ADBench. DAMI is genuinely harder to rank on: it has a larger fraction of datasets whose true-best detector is a global method (52% vs 28% on ADBench) and lower separability (best-minus-mean gap 0.067 vs 0.093). Handing the user ADRank's top three picks instead of one halves this gap with no method change: regret@3 = 0.020 ± 0.004.</w:t>
+        <w:t xml:space="preserve">On the independently-preprocessed DAMI datasets, auto-calibrated NoMaS cuts regret by 41% versus random (regret@1 = 0.040 ± 0.004 vs 0.067), with the fixed ensemble at 36%. This is a clear, significant transfer, but well below the 78% on ADBench. DAMI is genuinely harder to rank on: it has a larger fraction of datasets whose true-best detector is a global method (52% vs 28% on ADBench) and lower separability (best-minus-mean gap 0.067 vs 0.093). Handing the user NoMaS's top three picks instead of one halves this gap with no method change: regret@3 = 0.020 ± 0.004.</w:t>
       </w:r>
     </w:p>
     <w:p>
@@ -9931,7 +10021,7 @@
         <w:rPr>
           <w:color w:val="000000"/>
         </w:rPr>
-        <w:t xml:space="preserve">. ADRank picks a local-density detector (LOF/KNN/CBLOF) on 98% of DAMI dataset-seed cases, but the true best is local on only 48%; when the true best is a global detector (HBOS/COPOD/ECOD/PCA), no cluster-based regime in the bank can make it win, and the best-achievable-in-bank regret on those cases (0.039) is 5× that on local-best cases (0.008). The two clustering ablations that follow (global-tail regime and deep clustering) run on the nine DAMI datasets that exclude the 1555-dimensional InternetAds, on which k-means auto-calibrated regret is 0.034. The natural remedy, adding a global-tail pseudo-anomaly regime (points in the marginal tails or far from the centroid, rather than held-out clusters), does not help and slightly hurts: DAMI regret rises from 0.034 to 0.036-0.045 as such regimes are added. The mechanism is instructive: a global-tail task is high-variance (marginal detectors ace it), so the discriminative weight over-trusts it, but it is not truth-aligned, so it drags the pick toward marginal detectors even when they are wrong. The label-free weighting cannot distinguish a high-variance-but-misaligned regime from an informative one.</w:t>
+        <w:t xml:space="preserve">. NoMaS picks a local-density detector (LOF/KNN/CBLOF) on 98% of DAMI dataset-seed cases, but the true best is local on only 48%; when the true best is a global detector (HBOS/COPOD/ECOD/PCA), no cluster-based regime in the bank can make it win, and the best-achievable-in-bank regret on those cases (0.039) is 5× that on local-best cases (0.008). The two clustering ablations that follow (global-tail regime and deep clustering) run on the nine DAMI datasets that exclude the 1555-dimensional InternetAds, on which k-means auto-calibrated regret is 0.034. The natural remedy, adding a global-tail pseudo-anomaly regime (points in the marginal tails or far from the centroid, rather than held-out clusters), does not help and slightly hurts: DAMI regret rises from 0.034 to 0.036-0.045 as such regimes are added. The mechanism is instructive: a global-tail task is high-variance (marginal detectors ace it), so the discriminative weight over-trusts it, but it is not truth-aligned, so it drags the pick toward marginal detectors even when they are wrong. The label-free weighting cannot distinguish a high-variance-but-misaligned regime from an informative one.</w:t>
       </w:r>
     </w:p>
     <w:p>
@@ -9992,7 +10082,7 @@
         <w:rPr>
           <w:color w:val="000000"/>
         </w:rPr>
-        <w:t xml:space="preserve">Random selection is a weak yardstick. The decision a practitioner actually faces is which single detector to commit to across all their datasets, so the demanding baseline is the best fixed detector, not a coin flip. We compare ADRank against every fixed detector, both in-distribution (ADBench, DAMI) and on a frozen external benchmark it never saw during development.</w:t>
+        <w:t xml:space="preserve">Random selection is a weak yardstick. The decision a practitioner actually faces is which single detector to commit to across all their datasets, so the demanding baseline is the best fixed detector, not a coin flip. We compare NoMaS against every fixed detector, both in-distribution (ADBench, DAMI) and on a frozen external benchmark it never saw during development.</w:t>
       </w:r>
     </w:p>
     <w:p>
@@ -10107,7 +10197,7 @@
                 <w:color w:val="000000"/>
                 <w:sz w:val="19"/>
               </w:rPr>
-              <w:t xml:space="preserve">ADRank</w:t>
+              <w:t xml:space="preserve">NoMaS</w:t>
             </w:r>
           </w:p>
         </w:tc>
@@ -11033,7 +11123,7 @@
           <w:i/>
           <w:color w:val="000000"/>
         </w:rPr>
-        <w:t>Auto-calibrated ADRank versus fixed-detector baselines, mean regret@1 over each modality's datasets and five seeds. The best-fixed column is LOF, computed per seed like the other columns. p is a paired Wilcoxon test of ADRank against always-IForest. ADRank significantly beats the common IForest default on image, text, and tabular data, matches or beats the strongest fixed detector (LOF) on the four ADBench modalities, and is statistically indistinguishable from it on DAMI (paired p = 0.63, n = 10).</w:t>
+        <w:t>Auto-calibrated NoMaS versus fixed-detector baselines, mean regret@1 over each modality's datasets and five seeds. The best-fixed column is LOF, computed per seed like the other columns. p is a paired Wilcoxon test of NoMaS against always-IForest. NoMaS significantly beats the common IForest default on image, text, and tabular data, matches or beats the strongest fixed detector (LOF) on the four ADBench modalities, and is statistically indistinguishable from it on DAMI (paired p = 0.63, n = 10).</w:t>
       </w:r>
     </w:p>
     <w:p>
@@ -11048,7 +11138,7 @@
         <w:rPr>
           <w:color w:val="000000"/>
         </w:rPr>
-        <w:t xml:space="preserve">Against the detector a practitioner would most plausibly reach for, Isolation Forest, ADRank cuts regret significantly on image (p = 4e-6), text (p = 5e-4), and tabular (p = 0.01) data, and it matches or beats the best fixed detector in the panel (LOF) on the four ADBench modalities without knowing in advance that LOF is the one to pick. We then freeze the method entirely (the smallest+random+hard regime bank, K in {30, 50}, discriminative weighting, no tuning) and run it on 260 OddBench [22] datasets hash-sampled by name and never used in any development step, of which 187 pass the fixed suitability filter (200 ≤ n ≤ 50000, d ≤ 500, anomaly rate in [0.005, 0.35]). Frozen ADRank cuts regret versus random by 38% in the mean and 48% in the per-dataset median, beating random on 134 of 187 datasets (paired Wilcoxon p = 1e-10).</w:t>
+        <w:t xml:space="preserve">Against the detector a practitioner would most plausibly reach for, Isolation Forest, NoMaS cuts regret significantly on image (p = 4e-6), text (p = 5e-4), and tabular (p = 0.01) data, and it matches or beats the best fixed detector in the panel (LOF) on the four ADBench modalities without knowing in advance that LOF is the one to pick. We then freeze the method entirely (the smallest+random+hard regime bank, K in {30, 50}, discriminative weighting, no tuning) and run it on 260 OddBench [22] datasets hash-sampled by name and never used in any development step, of which 187 pass the fixed suitability filter (200 ≤ n ≤ 50000, d ≤ 500, anomaly rate in [0.005, 0.35]). Frozen NoMaS cuts regret versus random by 38% in the mean and 48% in the per-dataset median, beating random on 134 of 187 datasets (paired Wilcoxon p = 1e-10).</w:t>
       </w:r>
     </w:p>
     <w:p>
@@ -11193,7 +11283,7 @@
                 <w:color w:val="000000"/>
                 <w:sz w:val="19"/>
               </w:rPr>
-              <w:t xml:space="preserve">ADRank vs. it (paired)</w:t>
+              <w:t xml:space="preserve">NoMaS vs. it (paired)</w:t>
             </w:r>
           </w:p>
         </w:tc>
@@ -11227,7 +11317,7 @@
                 <w:color w:val="000000"/>
                 <w:sz w:val="19"/>
               </w:rPr>
-              <w:t xml:space="preserve">ADRank</w:t>
+              <w:t xml:space="preserve">NoMaS</w:t>
             </w:r>
           </w:p>
         </w:tc>
@@ -11903,7 +11993,7 @@
           <w:i/>
           <w:color w:val="000000"/>
         </w:rPr>
-        <w:t>Frozen ADRank versus all nine fixed detectors on 187 unseen OddBench datasets. ADRank has the lowest mean regret of any label-free strategy: it ties the three strongest fixed detectors (IForest, KNN, PCA; PCA scored on the 165 datasets where it is defined) and significantly beats the other six.</w:t>
+        <w:t>Frozen NoMaS versus all nine fixed detectors on 187 unseen OddBench datasets. NoMaS has the lowest mean regret of any label-free strategy: it ties the three strongest fixed detectors (IForest, KNN, PCA; PCA scored on the 165 datasets where it is defined) and significantly beats the other six.</w:t>
       </w:r>
     </w:p>
     <w:p>
@@ -11918,7 +12008,7 @@
         <w:rPr>
           <w:color w:val="000000"/>
         </w:rPr>
-        <w:t xml:space="preserve">Two points make this the paper's central performance claim. First, ADRank has the lowest mean regret of any label-free strategy on both the in-distribution modalities and the 187 unseen datasets: no single fixed detector matches it across settings. Second, the best fixed detector</w:t>
+        <w:t xml:space="preserve">Two points make this the paper's central performance claim. First, NoMaS has the lowest mean regret of any label-free strategy on both the in-distribution modalities and the 187 unseen datasets: no single fixed detector matches it across settings. Second, the best fixed detector</w:t>
       </w:r>
       <w:r>
         <w:rPr>
@@ -11944,7 +12034,7 @@
         <w:rPr>
           <w:color w:val="000000"/>
         </w:rPr>
-        <w:t xml:space="preserve">between benchmarks, LOF is strongest in-distribution, Isolation Forest on OddBench, so committing to any one detector in advance is unsafe, and ADRank attains the best-fixed level on each benchmark without knowing which detector that is. On OddBench it ties that benchmark's best fixed detector (IForest, p = 0.51) rather than beating it; matching the dominant detector is the ceiling of any selector when a single detector dominates a corpus. The 53 datasets where ADRank trails random share the structural cause of Section 5.4: each has a global or marginal detector at near-perfect AUC (HBOS or PCA at 1.000 on DoctorVisits, CampaignOutcome, and similar single-feature-threshold labels) that cluster-holdout's local pseudo-anomalies cannot construct. The failure is the local-versus-global ceiling, now confirmed out of distribution, not a breakdown of the ranking signal.</w:t>
+        <w:t xml:space="preserve">between benchmarks, LOF is strongest in-distribution, Isolation Forest on OddBench, so committing to any one detector in advance is unsafe, and NoMaS attains the best-fixed level on each benchmark without knowing which detector that is. On OddBench it ties that benchmark's best fixed detector (IForest, p = 0.51) rather than beating it; matching the dominant detector is the ceiling of any selector when a single detector dominates a corpus. The 53 datasets where NoMaS trails random share the structural cause of Section 5.4: each has a global or marginal detector at near-perfect AUC (HBOS or PCA at 1.000 on DoctorVisits, CampaignOutcome, and similar single-feature-threshold labels) that cluster-holdout's local pseudo-anomalies cannot construct. The failure is the local-versus-global ceiling, now confirmed out of distribution, not a breakdown of the ranking signal.</w:t>
       </w:r>
     </w:p>
     <w:p>
@@ -11996,7 +12086,7 @@
         <w:rPr>
           <w:color w:val="000000"/>
         </w:rPr>
-        <w:t xml:space="preserve">(Section 4) collapses each benchmark to the fraction of the achievable random-to-oracle improvement a method captures. Table 7 reports it for every label-free strategy across all six benchmarks, each on a common dataset panel so the methods are scored on identical data. On frozen OddBench ADRank scores</w:t>
+        <w:t xml:space="preserve">(Section 4) collapses each benchmark to the fraction of the achievable random-to-oracle improvement a method captures. Table 7 reports it for every label-free strategy across all six benchmarks, each on a common dataset panel so the methods are scored on identical data. On frozen OddBench NoMaS scores</w:t>
       </w:r>
       <w:r>
         <w:rPr>
@@ -12028,7 +12118,7 @@
         <w:rPr>
           <w:color w:val="000000"/>
         </w:rPr>
-        <w:t xml:space="preserve">(95% dataset-bootstrap CI [0.27, 0.47]). The pattern is the point: ADRank has the highest worst-case skill of any method (0.38, its minimum across the six), while the popular Isolation Forest default and both internal metrics (EM, MV) each fall below random (</w:t>
+        <w:t xml:space="preserve">(95% dataset-bootstrap CI [0.27, 0.47]). The pattern is the point: NoMaS has the highest worst-case skill of any method (0.38, its minimum across the six), while the popular Isolation Forest default and both internal metrics (EM, MV) each fall below random (</w:t>
       </w:r>
       <m:oMath>
         <m:r>
@@ -12048,7 +12138,7 @@
         <w:rPr>
           <w:color w:val="000000"/>
         </w:rPr>
-        <w:t xml:space="preserve">) on at least one benchmark. The local-density detectors LOF and KNN stay positive everywhere too, but at a lower floor (0.21 and 0.23), and neither takes the top skill on tabular or OddBench, the two benchmarks where selection is hardest, which ADRank alone does.</w:t>
+        <w:t xml:space="preserve">) on at least one benchmark. The local-density detectors LOF and KNN stay positive everywhere too, but at a lower floor (0.21 and 0.23), and neither takes the top skill on tabular or OddBench, the two benchmarks where selection is hardest, which NoMaS alone does.</w:t>
       </w:r>
     </w:p>
     <w:p>
@@ -12392,7 +12482,7 @@
                 <w:color w:val="000000"/>
                 <w:sz w:val="18"/>
               </w:rPr>
-              <w:t xml:space="preserve">ADRank</w:t>
+              <w:t xml:space="preserve">NoMaS</w:t>
             </w:r>
           </w:p>
         </w:tc>
@@ -13880,11 +13970,11 @@
           <w:i/>
           <w:color w:val="000000"/>
         </w:rPr>
-        <w:t>Selection skill S (pooled, Section 4; 1 = oracle, 0 = random, negative = worse than random) for each label-free strategy, computed on a common per-benchmark dataset panel so all methods are scored on identical datasets. "worst" is each method's minimum across the six benchmarks. ADRank has the highest worst-case skill; Isolation Forest and the EM/MV internal metrics each fall below random on at least one benchmark. EM/MV were not run on the external OddBench.</w:t>
+        <w:t>Selection skill S (pooled, Section 4; 1 = oracle, 0 = random, negative = worse than random) for each label-free strategy, computed on a common per-benchmark dataset panel so all methods are scored on identical datasets. "worst" is each method's minimum across the six benchmarks. NoMaS has the highest worst-case skill; Isolation Forest and the EM/MV internal metrics each fall below random on at least one benchmark. EM/MV were not run on the external OddBench.</w:t>
       </w:r>
     </w:p>
     <w:bookmarkEnd w:id="28"/>
-    <w:bookmarkStart w:id="32" w:name="X4c621d3d5d01d0190f366e11e8a32fcdaa42af6"/>
+    <w:bookmarkStart w:id="32" w:name="Xe5c2fdff2fadd7c0d2c02eaeb39010a81999dc4"/>
     <w:p>
       <w:pPr>
         <w:pStyle w:val="Heading3"/>
@@ -13896,7 +13986,7 @@
         <w:rPr>
           <w:color w:val="000000"/>
         </w:rPr>
-        <w:t xml:space="preserve">5.6 Does ADRank need real anomalies in its input?</w:t>
+        <w:t xml:space="preserve">5.6 Does NoMaS need real anomalies in its input?</w:t>
       </w:r>
     </w:p>
     <w:p>
@@ -13911,7 +14001,7 @@
         <w:rPr>
           <w:color w:val="000000"/>
         </w:rPr>
-        <w:t xml:space="preserve">ADRank clusters and holds out subsets of an unlabeled dataset that, in the benchmarks, contains genuine (unlabeled) anomalies. A natural concern is whether the method draws its ranking signal from those hidden anomalies rather than from the normal structure. We test this directly: for each of 24 ADBench tabular datasets we give ADRank a selection input consisting of all normal points plus a controlled fraction of the real anomalies (0%, 0.5%, 1%, 2%, 5%, and the natural rate), unlabeled, while the true ranking is computed by the fixed protocol and does not depend on that fraction. At 0% the selection input is pure normal data.</w:t>
+        <w:t xml:space="preserve">NoMaS clusters and holds out subsets of an unlabeled dataset that, in the benchmarks, contains genuine (unlabeled) anomalies. A natural concern is whether the method draws its ranking signal from those hidden anomalies rather than from the normal structure. We test this directly: for each of 24 ADBench tabular datasets we give NoMaS a selection input consisting of all normal points plus a controlled fraction of the real anomalies (0%, 0.5%, 1%, 2%, 5%, and the natural rate), unlabeled, while the true ranking is computed by the fixed protocol and does not depend on that fraction. At 0% the selection input is pure normal data.</w:t>
       </w:r>
     </w:p>
     <w:p>
@@ -13930,7 +14020,7 @@
           <wp:inline>
             <wp:extent cx="2984601" cy="1836677"/>
             <wp:effectExtent b="0" l="0" r="0" t="0"/>
-            <wp:docPr descr="Regret versus the fraction of real anomalies revealed in ADRank's selection input; the curve is flat and far below random" title="" id="30" name="Picture"/>
+            <wp:docPr descr="Regret versus the fraction of real anomalies revealed in NoMaS's selection input; the curve is flat and far below random" title="" id="30" name="Picture"/>
             <a:graphic>
               <a:graphicData uri="http://schemas.openxmlformats.org/drawingml/2006/picture">
                 <pic:pic>
@@ -13999,7 +14089,7 @@
           <w:i/>
           <w:color w:val="000000"/>
         </w:rPr>
-        <w:t>Regret@1 versus the fraction of real anomalies present in ADRank's unlabeled selection input, mean over 24 tabular datasets and three seeds (error bars are the standard error over datasets). The curve is flat: regret at 0% real anomalies (pure normals, 0.024) is indistinguishable from regret at the natural contamination rate (0.022), and every level sits 4-6× below the random-pick baseline (0.099).</w:t>
+        <w:t>Regret@1 versus the fraction of real anomalies present in NoMaS's unlabeled selection input, mean over 24 tabular datasets and three seeds (error bars are the standard error over datasets). The curve is flat: regret at 0% real anomalies (pure normals, 0.024) is indistinguishable from regret at the natural contamination rate (0.022), and every level sits 4-6× below the random-pick baseline (0.099).</w:t>
       </w:r>
     </w:p>
     <w:p>
@@ -14014,7 +14104,7 @@
         <w:rPr>
           <w:color w:val="000000"/>
         </w:rPr>
-        <w:t xml:space="preserve">The regret curve is flat across contamination levels (0.016-0.026) and 4-6× below random everywhere. Critically, regret at 0% real anomalies (0.024) is within 0.002 of the natural rate (0.022). ADRank therefore does not rely on hidden real anomalies: it recovers the detector ranking from the normal cluster geometry alone, and works equally in the contaminated-unlabeled and the normal-only regimes.</w:t>
+        <w:t xml:space="preserve">The regret curve is flat across contamination levels (0.016-0.026) and 4-6× below random everywhere. Critically, regret at 0% real anomalies (0.024) is within 0.002 of the natural rate (0.022). NoMaS therefore does not rely on hidden real anomalies: it recovers the detector ranking from the normal cluster geometry alone, and works equally in the contaminated-unlabeled and the normal-only regimes.</w:t>
       </w:r>
     </w:p>
     <w:bookmarkEnd w:id="32"/>
@@ -14077,7 +14167,7 @@
           <w:bCs/>
           <w:color w:val="000000"/>
         </w:rPr>
-        <w:t xml:space="preserve">When ADRank helps.</w:t>
+        <w:t xml:space="preserve">When NoMaS helps.</w:t>
       </w:r>
       <w:r>
         <w:rPr>
@@ -14089,7 +14179,7 @@
         <w:rPr>
           <w:color w:val="000000"/>
         </w:rPr>
-        <w:t xml:space="preserve">With auto-calibration the method selects a near-best detector on all four ADBench modalities (regret@1 ≤ 0.020, 78-93% below random, within 0.01 of the labels-based oracle), and the one modality a single fixed regime under-served, text, is brought in line by the same label-free weighting. The strength has clear bounds: on the DAMI benchmark the oracle gap is larger (41% reduction), and on 187 unseen OddBench datasets ADRank ties rather than beats that benchmark's best fixed detector and trails random on 53 of them. These bounds share one cause, datasets whose best detector is global rather than local (Section 5.4): where the best detector is a local-density method ADRank reliably finds it, and where it is global, cluster-holdout cannot yet construct the task.</w:t>
+        <w:t xml:space="preserve">With auto-calibration the method selects a near-best detector on all four ADBench modalities (regret@1 ≤ 0.020, 78-93% below random, within 0.01 of the labels-based oracle), and the one modality a single fixed regime under-served, text, is brought in line by the same label-free weighting. The strength has clear bounds: on the DAMI benchmark the oracle gap is larger (41% reduction), and on 187 unseen OddBench datasets NoMaS ties rather than beats that benchmark's best fixed detector and trails random on 53 of them. These bounds share one cause, datasets whose best detector is global rather than local (Section 5.4): where the best detector is a local-density method NoMaS reliably finds it, and where it is global, cluster-holdout cannot yet construct the task.</w:t>
       </w:r>
     </w:p>
     <w:p>
@@ -14176,7 +14266,7 @@
         <w:rPr>
           <w:color w:val="000000"/>
         </w:rPr>
-        <w:t xml:space="preserve">One ADRank pass over nine detectors, 20 cluster draws, and one dataset takes seconds to minutes on CPU. The whole 26-dataset tabular benchmark runs in ~35 minutes. There is no meta-training, no GPU dependency, and no external service.</w:t>
+        <w:t xml:space="preserve">One NoMaS pass over nine detectors, 20 cluster draws, and one dataset takes seconds to minutes on CPU. The whole 26-dataset tabular benchmark runs in ~35 minutes. There is no meta-training, no GPU dependency, and no external service.</w:t>
       </w:r>
     </w:p>
     <w:bookmarkEnd w:id="34"/>
@@ -14256,7 +14346,7 @@
         <w:rPr>
           <w:color w:val="000000"/>
         </w:rPr>
-        <w:t xml:space="preserve">-cluster selection degrades and the smallest+random ensemble is needed, and on time-series a richer window descriptor is needed than a handful of summary statistics. The evaluation uses fixed default hyperparameters per detector; combining ADRank with per-detector hyperparameter search is left to future work. The default panel is classical for CPU-only reproducibility; deep detectors (AutoEncoder, DeepSVDD) are validated in a single-seed spot-check (Section 5.4) rather than the full five-seed sweep. Confidence intervals are derived from five seeds; regret standard deviations are already small (≤ 0.010), so more seeds would tighten them marginally without changing the ordering of modalities.</w:t>
+        <w:t xml:space="preserve">-cluster selection degrades and the smallest+random ensemble is needed, and on time-series a richer window descriptor is needed than a handful of summary statistics. The evaluation uses fixed default hyperparameters per detector; combining NoMaS with per-detector hyperparameter search is left to future work. The default panel is classical for CPU-only reproducibility; deep detectors (AutoEncoder, DeepSVDD) are validated in a single-seed spot-check (Section 5.4) rather than the full five-seed sweep. Confidence intervals are derived from five seeds; regret standard deviations are already small (≤ 0.010), so more seeds would tighten them marginally without changing the ordering of modalities.</w:t>
       </w:r>
     </w:p>
     <w:bookmarkEnd w:id="35"/>
@@ -16094,7 +16184,7 @@
           <wp:inline>
             <wp:extent cx="2984601" cy="5223051"/>
             <wp:effectExtent b="0" l="0" r="0" t="0"/>
-            <wp:docPr descr="Per-dataset scatter of ADRank-predicted rank against true rank" title="" id="39" name="Picture"/>
+            <wp:docPr descr="Per-dataset scatter of NoMaS-predicted rank against true rank" title="" id="39" name="Picture"/>
             <a:graphic>
               <a:graphicData uri="http://schemas.openxmlformats.org/drawingml/2006/picture">
                 <pic:pic>
@@ -16158,7 +16248,7 @@
         <w:rPr>
           <w:color w:val="000000"/>
         </w:rPr>
-        <w:t xml:space="preserve">Predicted rank (ADRank) vs true rank per detector, one panel per dataset. Dashed grey identity line. Datasets where the scatter clusters near the diagonal (vowels, magic.gamma, optdigits, satellite, Pima, PageBlocks, satimage-2, Waveform) contribute the bulk of the aggregate signal. Datasets with saturated true AUC (WBC, WDBC, mammography) show noise-dominated tie-breaking.</w:t>
+        <w:t xml:space="preserve">Predicted rank (NoMaS) vs true rank per detector, one panel per dataset. Dashed grey identity line. Datasets where the scatter clusters near the diagonal (vowels, magic.gamma, optdigits, satellite, Pima, PageBlocks, satimage-2, Waveform) contribute the bulk of the aggregate signal. Datasets with saturated true AUC (WBC, WDBC, mammography) show noise-dominated tie-breaking.</w:t>
       </w:r>
     </w:p>
     <w:bookmarkEnd w:id="41"/>
@@ -16205,7 +16295,7 @@
         <w:rPr>
           <w:color w:val="000000"/>
         </w:rPr>
-        <w:t xml:space="preserve">The drop-one analysis runs on the original 10-detector panel (the nine detectors of Section 4 plus OCSVM): we recompute ADRank ρ using only 9 of the 10 detectors, dropping each one in turn (Table B.1). Baseline ρ = 0.599 on the spread ≥ 0.10 subset with all 10.</w:t>
+        <w:t xml:space="preserve">The drop-one analysis runs on the original 10-detector panel (the nine detectors of Section 4 plus OCSVM): we recompute NoMaS ρ using only 9 of the 10 detectors, dropping each one in turn (Table B.1). Baseline ρ = 0.599 on the spread ≥ 0.10 subset with all 10.</w:t>
       </w:r>
     </w:p>
     <w:p>
@@ -17387,7 +17477,7 @@
         <w:rPr>
           <w:color w:val="000000"/>
         </w:rPr>
-        <w:t xml:space="preserve">We re-run with AutoEncoder and DeepSVDD added (an 11-detector panel) on a matched spot-check (7-8 datasets per modality, single seed, K = 30 regimes) and compare against the classical 9-detector panel on the same datasets and config (Table B.2). The headline holds: auto-calibrated ADRank still cuts regret 85-94% below random with the deep detectors in the panel.</w:t>
+        <w:t xml:space="preserve">We re-run with AutoEncoder and DeepSVDD added (an 11-detector panel) on a matched spot-check (7-8 datasets per modality, single seed, K = 30 regimes) and compare against the classical 9-detector panel on the same datasets and config (Table B.2). The headline holds: auto-calibrated NoMaS still cuts regret 85-94% below random with the deep detectors in the panel.</w:t>
       </w:r>
     </w:p>
     <w:p>
@@ -19657,7 +19747,7 @@
         <w:rPr>
           <w:color w:val="000000"/>
         </w:rPr>
-        <w:t xml:space="preserve">ADRank v1 · Ranking Anomaly Detectors from Normal Data Alone</w:t>
+        <w:t xml:space="preserve">NoMaS v1 · Anomaly Detector Model Selection by Normal Manifold Separability</w:t>
       </w:r>
     </w:p>
     <w:bookmarkEnd w:id="69"/>

</xml_diff>